<commit_message>
Update of the 2 ReadMe
</commit_message>
<xml_diff>
--- a/Test/README Test.docx
+++ b/Test/README Test.docx
@@ -61,10 +61,7 @@
       </w:r>
       <w:proofErr w:type="spellStart"/>
       <w:r>
-        <w:t>Inte</w:t>
-      </w:r>
-      <w:r>
-        <w:t>grity_Raster</w:t>
+        <w:t>Integrity_Raster</w:t>
       </w:r>
       <w:proofErr w:type="spellEnd"/>
     </w:p>
@@ -116,10 +113,7 @@
         <w:t> : fichier de style pour</w:t>
       </w:r>
       <w:r>
-        <w:t xml:space="preserve"> représenter la </w:t>
-      </w:r>
-      <w:r>
-        <w:t>couche raster</w:t>
+        <w:t xml:space="preserve"> représenter la couche raster</w:t>
       </w:r>
     </w:p>
     <w:p>
@@ -919,10 +913,7 @@
       </w:r>
       <w:proofErr w:type="spellStart"/>
       <w:r>
-        <w:t>Integrity_</w:t>
-      </w:r>
-      <w:r>
-        <w:t>Raster</w:t>
+        <w:t>Integrity_Raster</w:t>
       </w:r>
       <w:proofErr w:type="spellEnd"/>
       <w:r>
@@ -949,39 +940,17 @@
           <w:szCs w:val="21"/>
           <w:lang w:eastAsia="fr-FR"/>
         </w:rPr>
-        <w:t>CLASSES_</w:t>
-      </w:r>
-      <w:proofErr w:type="gramStart"/>
-      <w:r>
-        <w:rPr>
-          <w:rFonts w:ascii="Consolas" w:eastAsia="Times New Roman" w:hAnsi="Consolas" w:cs="Times New Roman"/>
-          <w:color w:val="79C0FF"/>
+        <w:t>CLASSES_1</w:t>
+      </w:r>
+      <w:r>
+        <w:rPr>
+          <w:rFonts w:ascii="Consolas" w:eastAsia="Times New Roman" w:hAnsi="Consolas" w:cs="Times New Roman"/>
+          <w:color w:val="BBBEBF"/>
           <w:sz w:val="21"/>
           <w:szCs w:val="21"/>
           <w:lang w:eastAsia="fr-FR"/>
         </w:rPr>
-        <w:t>1</w:t>
-      </w:r>
-      <w:r>
-        <w:rPr>
-          <w:rFonts w:ascii="Consolas" w:eastAsia="Times New Roman" w:hAnsi="Consolas" w:cs="Times New Roman"/>
-          <w:color w:val="BBBEBF"/>
-          <w:sz w:val="21"/>
-          <w:szCs w:val="21"/>
-          <w:lang w:eastAsia="fr-FR"/>
-        </w:rPr>
-        <w:t>:</w:t>
-      </w:r>
-      <w:proofErr w:type="gramEnd"/>
-      <w:r>
-        <w:rPr>
-          <w:rFonts w:ascii="Consolas" w:eastAsia="Times New Roman" w:hAnsi="Consolas" w:cs="Times New Roman"/>
-          <w:color w:val="BBBEBF"/>
-          <w:sz w:val="21"/>
-          <w:szCs w:val="21"/>
-          <w:lang w:eastAsia="fr-FR"/>
-        </w:rPr>
-        <w:t xml:space="preserve"> </w:t>
+        <w:t xml:space="preserve">: </w:t>
       </w:r>
       <w:proofErr w:type="spellStart"/>
       <w:r>
@@ -1098,39 +1067,17 @@
           <w:szCs w:val="21"/>
           <w:lang w:eastAsia="fr-FR"/>
         </w:rPr>
-        <w:t>CLASSES_</w:t>
-      </w:r>
-      <w:proofErr w:type="gramStart"/>
-      <w:r>
-        <w:rPr>
-          <w:rFonts w:ascii="Consolas" w:eastAsia="Times New Roman" w:hAnsi="Consolas" w:cs="Times New Roman"/>
-          <w:color w:val="79C0FF"/>
+        <w:t>CLASSES_0</w:t>
+      </w:r>
+      <w:r>
+        <w:rPr>
+          <w:rFonts w:ascii="Consolas" w:eastAsia="Times New Roman" w:hAnsi="Consolas" w:cs="Times New Roman"/>
+          <w:color w:val="BBBEBF"/>
           <w:sz w:val="21"/>
           <w:szCs w:val="21"/>
           <w:lang w:eastAsia="fr-FR"/>
         </w:rPr>
-        <w:t>0</w:t>
-      </w:r>
-      <w:r>
-        <w:rPr>
-          <w:rFonts w:ascii="Consolas" w:eastAsia="Times New Roman" w:hAnsi="Consolas" w:cs="Times New Roman"/>
-          <w:color w:val="BBBEBF"/>
-          <w:sz w:val="21"/>
-          <w:szCs w:val="21"/>
-          <w:lang w:eastAsia="fr-FR"/>
-        </w:rPr>
-        <w:t>:</w:t>
-      </w:r>
-      <w:proofErr w:type="gramEnd"/>
-      <w:r>
-        <w:rPr>
-          <w:rFonts w:ascii="Consolas" w:eastAsia="Times New Roman" w:hAnsi="Consolas" w:cs="Times New Roman"/>
-          <w:color w:val="BBBEBF"/>
-          <w:sz w:val="21"/>
-          <w:szCs w:val="21"/>
-          <w:lang w:eastAsia="fr-FR"/>
-        </w:rPr>
-        <w:t xml:space="preserve"> </w:t>
+        <w:t xml:space="preserve">: </w:t>
       </w:r>
       <w:proofErr w:type="spellStart"/>
       <w:r>
@@ -1236,7 +1183,7 @@
           <w:color w:val="BBBEBF"/>
           <w:sz w:val="21"/>
           <w:szCs w:val="21"/>
-          <w:lang w:eastAsia="fr-FR"/>
+          <w:lang w:val="en-GB" w:eastAsia="fr-FR"/>
         </w:rPr>
       </w:pPr>
       <w:r>
@@ -1245,7 +1192,7 @@
           <w:color w:val="79C0FF"/>
           <w:sz w:val="21"/>
           <w:szCs w:val="21"/>
-          <w:lang w:eastAsia="fr-FR"/>
+          <w:lang w:val="en-GB" w:eastAsia="fr-FR"/>
         </w:rPr>
         <w:t>CLASSES_NULL</w:t>
       </w:r>
@@ -1255,123 +1202,125 @@
           <w:color w:val="BBBEBF"/>
           <w:sz w:val="21"/>
           <w:szCs w:val="21"/>
-          <w:lang w:eastAsia="fr-FR"/>
+          <w:lang w:val="en-GB" w:eastAsia="fr-FR"/>
         </w:rPr>
         <w:t xml:space="preserve">: </w:t>
       </w:r>
+      <w:r>
+        <w:rPr>
+          <w:rFonts w:ascii="Consolas" w:eastAsia="Times New Roman" w:hAnsi="Consolas" w:cs="Times New Roman"/>
+          <w:color w:val="4EC9B0"/>
+          <w:sz w:val="21"/>
+          <w:szCs w:val="21"/>
+          <w:lang w:val="en-GB" w:eastAsia="fr-FR"/>
+        </w:rPr>
+        <w:t>str</w:t>
+      </w:r>
+      <w:r>
+        <w:rPr>
+          <w:rFonts w:ascii="Consolas" w:eastAsia="Times New Roman" w:hAnsi="Consolas" w:cs="Times New Roman"/>
+          <w:color w:val="BBBEBF"/>
+          <w:sz w:val="21"/>
+          <w:szCs w:val="21"/>
+          <w:lang w:val="en-GB" w:eastAsia="fr-FR"/>
+        </w:rPr>
+        <w:t xml:space="preserve"> </w:t>
+      </w:r>
+      <w:r>
+        <w:rPr>
+          <w:rFonts w:ascii="Consolas" w:eastAsia="Times New Roman" w:hAnsi="Consolas" w:cs="Times New Roman"/>
+          <w:color w:val="D4D4D4"/>
+          <w:sz w:val="21"/>
+          <w:szCs w:val="21"/>
+          <w:lang w:val="en-GB" w:eastAsia="fr-FR"/>
+        </w:rPr>
+        <w:t>=</w:t>
+      </w:r>
+      <w:r>
+        <w:rPr>
+          <w:rFonts w:ascii="Consolas" w:eastAsia="Times New Roman" w:hAnsi="Consolas" w:cs="Times New Roman"/>
+          <w:color w:val="BBBEBF"/>
+          <w:sz w:val="21"/>
+          <w:szCs w:val="21"/>
+          <w:lang w:val="en-GB" w:eastAsia="fr-FR"/>
+        </w:rPr>
+        <w:t xml:space="preserve"> </w:t>
+      </w:r>
+      <w:r>
+        <w:rPr>
+          <w:rFonts w:ascii="Consolas" w:eastAsia="Times New Roman" w:hAnsi="Consolas" w:cs="Times New Roman"/>
+          <w:color w:val="A5D6FF"/>
+          <w:sz w:val="21"/>
+          <w:szCs w:val="21"/>
+          <w:lang w:val="en-GB" w:eastAsia="fr-FR"/>
+        </w:rPr>
+        <w:t>"9 10 11"</w:t>
+      </w:r>
+      <w:r>
+        <w:rPr>
+          <w:rFonts w:ascii="Consolas" w:eastAsia="Times New Roman" w:hAnsi="Consolas" w:cs="Times New Roman"/>
+          <w:color w:val="BBBEBF"/>
+          <w:sz w:val="21"/>
+          <w:szCs w:val="21"/>
+          <w:lang w:val="en-GB" w:eastAsia="fr-FR"/>
+        </w:rPr>
+        <w:t xml:space="preserve">                             </w:t>
+      </w:r>
+      <w:r>
+        <w:rPr>
+          <w:rFonts w:ascii="Consolas" w:eastAsia="Times New Roman" w:hAnsi="Consolas" w:cs="Times New Roman"/>
+          <w:color w:val="8B949E"/>
+          <w:sz w:val="21"/>
+          <w:szCs w:val="21"/>
+          <w:lang w:val="en-GB" w:eastAsia="fr-FR"/>
+        </w:rPr>
+        <w:t xml:space="preserve"># ignored = </w:t>
+      </w:r>
       <w:proofErr w:type="spellStart"/>
       <w:r>
         <w:rPr>
           <w:rFonts w:ascii="Consolas" w:eastAsia="Times New Roman" w:hAnsi="Consolas" w:cs="Times New Roman"/>
-          <w:color w:val="4EC9B0"/>
-          <w:sz w:val="21"/>
-          <w:szCs w:val="21"/>
-          <w:lang w:eastAsia="fr-FR"/>
-        </w:rPr>
-        <w:t>str</w:t>
+          <w:color w:val="8B949E"/>
+          <w:sz w:val="21"/>
+          <w:szCs w:val="21"/>
+          <w:lang w:val="en-GB" w:eastAsia="fr-FR"/>
+        </w:rPr>
+        <w:t>NaN</w:t>
       </w:r>
       <w:proofErr w:type="spellEnd"/>
-      <w:r>
-        <w:rPr>
-          <w:rFonts w:ascii="Consolas" w:eastAsia="Times New Roman" w:hAnsi="Consolas" w:cs="Times New Roman"/>
-          <w:color w:val="BBBEBF"/>
-          <w:sz w:val="21"/>
-          <w:szCs w:val="21"/>
-          <w:lang w:eastAsia="fr-FR"/>
-        </w:rPr>
-        <w:t xml:space="preserve"> </w:t>
-      </w:r>
-      <w:r>
-        <w:rPr>
-          <w:rFonts w:ascii="Consolas" w:eastAsia="Times New Roman" w:hAnsi="Consolas" w:cs="Times New Roman"/>
-          <w:color w:val="D4D4D4"/>
-          <w:sz w:val="21"/>
-          <w:szCs w:val="21"/>
-          <w:lang w:eastAsia="fr-FR"/>
-        </w:rPr>
-        <w:t>=</w:t>
-      </w:r>
-      <w:r>
-        <w:rPr>
-          <w:rFonts w:ascii="Consolas" w:eastAsia="Times New Roman" w:hAnsi="Consolas" w:cs="Times New Roman"/>
-          <w:color w:val="BBBEBF"/>
-          <w:sz w:val="21"/>
-          <w:szCs w:val="21"/>
-          <w:lang w:eastAsia="fr-FR"/>
-        </w:rPr>
-        <w:t xml:space="preserve"> </w:t>
-      </w:r>
-      <w:r>
-        <w:rPr>
-          <w:rFonts w:ascii="Consolas" w:eastAsia="Times New Roman" w:hAnsi="Consolas" w:cs="Times New Roman"/>
-          <w:color w:val="A5D6FF"/>
-          <w:sz w:val="21"/>
-          <w:szCs w:val="21"/>
-          <w:lang w:eastAsia="fr-FR"/>
-        </w:rPr>
-        <w:t>"9 10 11"</w:t>
-      </w:r>
-      <w:r>
-        <w:rPr>
-          <w:rFonts w:ascii="Consolas" w:eastAsia="Times New Roman" w:hAnsi="Consolas" w:cs="Times New Roman"/>
-          <w:color w:val="BBBEBF"/>
-          <w:sz w:val="21"/>
-          <w:szCs w:val="21"/>
-          <w:lang w:eastAsia="fr-FR"/>
-        </w:rPr>
-        <w:t xml:space="preserve">                             </w:t>
-      </w:r>
-      <w:r>
-        <w:rPr>
-          <w:rFonts w:ascii="Consolas" w:eastAsia="Times New Roman" w:hAnsi="Consolas" w:cs="Times New Roman"/>
-          <w:color w:val="8B949E"/>
-          <w:sz w:val="21"/>
-          <w:szCs w:val="21"/>
-          <w:lang w:eastAsia="fr-FR"/>
-        </w:rPr>
-        <w:t xml:space="preserve"># </w:t>
-      </w:r>
-      <w:proofErr w:type="spellStart"/>
-      <w:r>
-        <w:rPr>
-          <w:rFonts w:ascii="Consolas" w:eastAsia="Times New Roman" w:hAnsi="Consolas" w:cs="Times New Roman"/>
-          <w:color w:val="8B949E"/>
-          <w:sz w:val="21"/>
-          <w:szCs w:val="21"/>
-          <w:lang w:eastAsia="fr-FR"/>
-        </w:rPr>
-        <w:t>ignored</w:t>
-      </w:r>
-      <w:proofErr w:type="spellEnd"/>
-      <w:r>
-        <w:rPr>
-          <w:rFonts w:ascii="Consolas" w:eastAsia="Times New Roman" w:hAnsi="Consolas" w:cs="Times New Roman"/>
-          <w:color w:val="8B949E"/>
-          <w:sz w:val="21"/>
-          <w:szCs w:val="21"/>
-          <w:lang w:eastAsia="fr-FR"/>
-        </w:rPr>
-        <w:t xml:space="preserve"> = NaN</w:t>
-      </w:r>
-      <w:bookmarkStart w:id="0" w:name="_GoBack"/>
-      <w:bookmarkEnd w:id="0"/>
-    </w:p>
-    <w:p/>
-    <w:p>
-      <w:pPr>
-        <w:pStyle w:val="Titre2"/>
-      </w:pPr>
-      <w:r>
-        <w:t>Output</w:t>
-      </w:r>
     </w:p>
     <w:p>
-      <w:r>
-        <w:t>Les outputs attendus sont mis dans le dossier output.</w:t>
+      <w:pPr>
+        <w:rPr>
+          <w:vertAlign w:val="superscript"/>
+          <w:lang w:val="en-GB"/>
+        </w:rPr>
+      </w:pPr>
+      <w:bookmarkStart w:id="0" w:name="_GoBack"/>
+      <w:r>
+        <w:rPr>
+          <w:vertAlign w:val="superscript"/>
+          <w:lang w:val="en-GB"/>
+        </w:rPr>
+        <w:t>2</w:t>
+      </w:r>
+    </w:p>
+    <w:bookmarkEnd w:id="0"/>
+    <w:p>
+      <w:pPr>
+        <w:pStyle w:val="Titre2"/>
+      </w:pPr>
+      <w:r>
+        <w:t>Output</w:t>
       </w:r>
     </w:p>
     <w:p>
       <w:r>
+        <w:t>Les outputs attendus sont mis dans le dossier output.</w:t>
+      </w:r>
+    </w:p>
+    <w:p>
+      <w:r>
         <w:t xml:space="preserve">Un fichier </w:t>
       </w:r>
       <w:proofErr w:type="spellStart"/>
@@ -1380,13 +1329,7 @@
       </w:r>
       <w:proofErr w:type="spellEnd"/>
       <w:r>
-        <w:t xml:space="preserve"> </w:t>
-      </w:r>
-      <w:r>
-        <w:t xml:space="preserve">y </w:t>
-      </w:r>
-      <w:r>
-        <w:t>est fourni pour offrir un exemple de style de représentation des valeurs d’intégrité.</w:t>
+        <w:t xml:space="preserve"> y est fourni pour offrir un exemple de style de représentation des valeurs d’intégrité.</w:t>
       </w:r>
     </w:p>
     <w:p/>
@@ -1673,16 +1616,7 @@
         <w:t>Cosia_Documentation_Technique_IGN_2023</w:t>
       </w:r>
       <w:r>
-        <w:t xml:space="preserve">.pdf : </w:t>
-      </w:r>
-      <w:r>
-        <w:t xml:space="preserve">pour avoir accès aux classifications de couverture des sols inclues dans la couche </w:t>
-      </w:r>
-      <w:r>
-        <w:t xml:space="preserve">primaire </w:t>
-      </w:r>
-      <w:r>
-        <w:t>à analyser</w:t>
+        <w:t>.pdf : pour avoir accès aux classifications de couverture des sols inclues dans la couche primaire à analyser</w:t>
       </w:r>
     </w:p>
     <w:p>
@@ -1697,16 +1631,7 @@
         <w:t>CarHab_42_Loire_Notice</w:t>
       </w:r>
       <w:r>
-        <w:t xml:space="preserve">.pdf </w:t>
-      </w:r>
-      <w:r>
-        <w:t xml:space="preserve">: pour avoir accès aux classifications de couverture des sols inclues dans la couche </w:t>
-      </w:r>
-      <w:r>
-        <w:t>secondaire</w:t>
-      </w:r>
-      <w:r>
-        <w:t xml:space="preserve"> à analyser</w:t>
+        <w:t>.pdf : pour avoir accès aux classifications de couverture des sols inclues dans la couche secondaire à analyser</w:t>
       </w:r>
     </w:p>
     <w:p>
@@ -3706,39 +3631,17 @@
           <w:szCs w:val="21"/>
           <w:lang w:eastAsia="fr-FR"/>
         </w:rPr>
-        <w:t>CLASSES_</w:t>
-      </w:r>
-      <w:proofErr w:type="gramStart"/>
-      <w:r>
-        <w:rPr>
-          <w:rFonts w:ascii="Consolas" w:eastAsia="Times New Roman" w:hAnsi="Consolas" w:cs="Times New Roman"/>
-          <w:color w:val="79C0FF"/>
+        <w:t>CLASSES_1</w:t>
+      </w:r>
+      <w:r>
+        <w:rPr>
+          <w:rFonts w:ascii="Consolas" w:eastAsia="Times New Roman" w:hAnsi="Consolas" w:cs="Times New Roman"/>
+          <w:color w:val="BBBEBF"/>
           <w:sz w:val="21"/>
           <w:szCs w:val="21"/>
           <w:lang w:eastAsia="fr-FR"/>
         </w:rPr>
-        <w:t>1</w:t>
-      </w:r>
-      <w:r>
-        <w:rPr>
-          <w:rFonts w:ascii="Consolas" w:eastAsia="Times New Roman" w:hAnsi="Consolas" w:cs="Times New Roman"/>
-          <w:color w:val="BBBEBF"/>
-          <w:sz w:val="21"/>
-          <w:szCs w:val="21"/>
-          <w:lang w:eastAsia="fr-FR"/>
-        </w:rPr>
-        <w:t>:</w:t>
-      </w:r>
-      <w:proofErr w:type="gramEnd"/>
-      <w:r>
-        <w:rPr>
-          <w:rFonts w:ascii="Consolas" w:eastAsia="Times New Roman" w:hAnsi="Consolas" w:cs="Times New Roman"/>
-          <w:color w:val="BBBEBF"/>
-          <w:sz w:val="21"/>
-          <w:szCs w:val="21"/>
-          <w:lang w:eastAsia="fr-FR"/>
-        </w:rPr>
-        <w:t xml:space="preserve"> </w:t>
+        <w:t xml:space="preserve">: </w:t>
       </w:r>
       <w:proofErr w:type="spellStart"/>
       <w:r>
@@ -3813,39 +3716,17 @@
           <w:szCs w:val="21"/>
           <w:lang w:eastAsia="fr-FR"/>
         </w:rPr>
-        <w:t>CLASSES_</w:t>
-      </w:r>
-      <w:proofErr w:type="gramStart"/>
-      <w:r>
-        <w:rPr>
-          <w:rFonts w:ascii="Consolas" w:eastAsia="Times New Roman" w:hAnsi="Consolas" w:cs="Times New Roman"/>
-          <w:color w:val="79C0FF"/>
+        <w:t>CLASSES_0</w:t>
+      </w:r>
+      <w:r>
+        <w:rPr>
+          <w:rFonts w:ascii="Consolas" w:eastAsia="Times New Roman" w:hAnsi="Consolas" w:cs="Times New Roman"/>
+          <w:color w:val="BBBEBF"/>
           <w:sz w:val="21"/>
           <w:szCs w:val="21"/>
           <w:lang w:eastAsia="fr-FR"/>
         </w:rPr>
-        <w:t>0</w:t>
-      </w:r>
-      <w:r>
-        <w:rPr>
-          <w:rFonts w:ascii="Consolas" w:eastAsia="Times New Roman" w:hAnsi="Consolas" w:cs="Times New Roman"/>
-          <w:color w:val="BBBEBF"/>
-          <w:sz w:val="21"/>
-          <w:szCs w:val="21"/>
-          <w:lang w:eastAsia="fr-FR"/>
-        </w:rPr>
-        <w:t>:</w:t>
-      </w:r>
-      <w:proofErr w:type="gramEnd"/>
-      <w:r>
-        <w:rPr>
-          <w:rFonts w:ascii="Consolas" w:eastAsia="Times New Roman" w:hAnsi="Consolas" w:cs="Times New Roman"/>
-          <w:color w:val="BBBEBF"/>
-          <w:sz w:val="21"/>
-          <w:szCs w:val="21"/>
-          <w:lang w:eastAsia="fr-FR"/>
-        </w:rPr>
-        <w:t xml:space="preserve"> </w:t>
+        <w:t xml:space="preserve">: </w:t>
       </w:r>
       <w:proofErr w:type="spellStart"/>
       <w:r>
@@ -3920,39 +3801,17 @@
           <w:szCs w:val="21"/>
           <w:lang w:eastAsia="fr-FR"/>
         </w:rPr>
-        <w:t>CLASSES_</w:t>
-      </w:r>
-      <w:proofErr w:type="gramStart"/>
-      <w:r>
-        <w:rPr>
-          <w:rFonts w:ascii="Consolas" w:eastAsia="Times New Roman" w:hAnsi="Consolas" w:cs="Times New Roman"/>
-          <w:color w:val="79C0FF"/>
+        <w:t>CLASSES_NULL</w:t>
+      </w:r>
+      <w:r>
+        <w:rPr>
+          <w:rFonts w:ascii="Consolas" w:eastAsia="Times New Roman" w:hAnsi="Consolas" w:cs="Times New Roman"/>
+          <w:color w:val="BBBEBF"/>
           <w:sz w:val="21"/>
           <w:szCs w:val="21"/>
           <w:lang w:eastAsia="fr-FR"/>
         </w:rPr>
-        <w:t>NULL</w:t>
-      </w:r>
-      <w:r>
-        <w:rPr>
-          <w:rFonts w:ascii="Consolas" w:eastAsia="Times New Roman" w:hAnsi="Consolas" w:cs="Times New Roman"/>
-          <w:color w:val="BBBEBF"/>
-          <w:sz w:val="21"/>
-          <w:szCs w:val="21"/>
-          <w:lang w:eastAsia="fr-FR"/>
-        </w:rPr>
-        <w:t>:</w:t>
-      </w:r>
-      <w:proofErr w:type="gramEnd"/>
-      <w:r>
-        <w:rPr>
-          <w:rFonts w:ascii="Consolas" w:eastAsia="Times New Roman" w:hAnsi="Consolas" w:cs="Times New Roman"/>
-          <w:color w:val="BBBEBF"/>
-          <w:sz w:val="21"/>
-          <w:szCs w:val="21"/>
-          <w:lang w:eastAsia="fr-FR"/>
-        </w:rPr>
-        <w:t xml:space="preserve"> </w:t>
+        <w:t xml:space="preserve">: </w:t>
       </w:r>
       <w:proofErr w:type="spellStart"/>
       <w:r>

</xml_diff>